<commit_message>
Ghidul autorului: capitol nou despre licențe (CC BY-SA 4.0 și MIT)
Co-Authored-By: Claude Opus 5.5 <noreply@anthropic.com>
</commit_message>
<xml_diff>
--- a/docs/LogicLab_Ghid_Autor.docx
+++ b/docs/LogicLab_Ghid_Autor.docx
@@ -19667,6 +19667,28 @@
           <w:bCs/>
           <w:color w:val="1F4E79"/>
         </w:rPr>
+        <w:t xml:space="preserve">❓ De ce ai ales licența CC BY-SA 4.0?</w:t>
+      </w:r>
+    </w:p>
+    <w:p>
+      <w:pPr>
+        <w:spacing w:after="120" w:line="288"/>
+      </w:pPr>
+      <w:r>
+        <w:t xml:space="preserve">Pentru că este licența standard pentru resurse educaționale deschise (o folosește și Wikipedia): oricine poate folosi și adapta lecțiile și întrebările, cu condiția să mă menționeze ca autor și să lase și versiunea lui la fel de deschisă. Pentru cod am ales MIT, o licență simplă de software, pentru că licențele Creative Commons nu sunt gândite pentru programe.</w:t>
+      </w:r>
+    </w:p>
+    <w:p>
+      <w:pPr>
+        <w:keepNext/>
+        <w:spacing w:after="60" w:before="200"/>
+      </w:pPr>
+      <w:r>
+        <w:rPr>
+          <w:b/>
+          <w:bCs/>
+          <w:color w:val="1F4E79"/>
+        </w:rPr>
         <w:t xml:space="preserve">❓ Ce înseamnă RED și cum o respectă proiectul?</w:t>
       </w:r>
     </w:p>
@@ -20456,6 +20478,1154 @@
         </w:tc>
       </w:tr>
     </w:tbl>
+    <w:p>
+      <w:pPr>
+        <w:pStyle w:val="Heading1"/>
+        <w:pageBreakBefore/>
+      </w:pPr>
+      <w:r>
+        <w:t xml:space="preserve">14. Licențele proiectului</w:t>
+      </w:r>
+    </w:p>
+    <w:p>
+      <w:pPr>
+        <w:spacing w:after="120" w:line="288"/>
+      </w:pPr>
+      <w:r>
+        <w:t xml:space="preserve">Proiectul are </w:t>
+      </w:r>
+      <w:r>
+        <w:rPr>
+          <w:b/>
+          <w:bCs/>
+        </w:rPr>
+        <w:t xml:space="preserve">două licențe</w:t>
+      </w:r>
+      <w:r>
+        <w:t xml:space="preserve">, una pentru conținut și una pentru cod. Amândouă sunt trecute în fișierul </w:t>
+      </w:r>
+      <w:r>
+        <w:rPr>
+          <w:rFonts w:ascii="Consolas" w:cs="Consolas" w:eastAsia="Consolas" w:hAnsi="Consolas"/>
+          <w:color w:val="8A2B2B"/>
+          <w:sz w:val="20"/>
+          <w:szCs w:val="20"/>
+        </w:rPr>
+        <w:t xml:space="preserve">LICENSE</w:t>
+      </w:r>
+      <w:r>
+        <w:t xml:space="preserve">, în </w:t>
+      </w:r>
+      <w:r>
+        <w:rPr>
+          <w:rFonts w:ascii="Consolas" w:cs="Consolas" w:eastAsia="Consolas" w:hAnsi="Consolas"/>
+          <w:color w:val="8A2B2B"/>
+          <w:sz w:val="20"/>
+          <w:szCs w:val="20"/>
+        </w:rPr>
+        <w:t xml:space="preserve">README.md</w:t>
+      </w:r>
+      <w:r>
+        <w:t xml:space="preserve"> și în subsolul aplicației.</w:t>
+      </w:r>
+    </w:p>
+    <w:tbl>
+      <w:tblPr>
+        <w:tblW w:type="dxa" w:w="9638"/>
+        <w:tblBorders>
+          <w:top w:val="single" w:color="auto" w:sz="4"/>
+          <w:left w:val="single" w:color="auto" w:sz="4"/>
+          <w:bottom w:val="single" w:color="auto" w:sz="4"/>
+          <w:right w:val="single" w:color="auto" w:sz="4"/>
+          <w:insideH w:val="single" w:color="auto" w:sz="4"/>
+          <w:insideV w:val="single" w:color="auto" w:sz="4"/>
+        </w:tblBorders>
+        <w:tblLayout w:type="fixed"/>
+      </w:tblPr>
+      <w:tblGrid>
+        <w:gridCol w:w="2600"/>
+        <w:gridCol w:w="2000"/>
+        <w:gridCol w:w="5038"/>
+      </w:tblGrid>
+      <w:tr>
+        <w:trPr>
+          <w:tblHeader/>
+        </w:trPr>
+        <w:tc>
+          <w:tcPr>
+            <w:tcW w:type="dxa" w:w="2600"/>
+            <w:tcBorders>
+              <w:top w:val="single" w:color="B7C4D3" w:sz="4"/>
+              <w:left w:val="single" w:color="B7C4D3" w:sz="4"/>
+              <w:bottom w:val="single" w:color="B7C4D3" w:sz="4"/>
+              <w:right w:val="single" w:color="B7C4D3" w:sz="4"/>
+            </w:tcBorders>
+            <w:shd w:fill="E3ECF5" w:color="auto" w:val="clear"/>
+            <w:tcMar>
+              <w:top w:type="dxa" w:w="80"/>
+              <w:left w:type="dxa" w:w="110"/>
+              <w:bottom w:type="dxa" w:w="80"/>
+              <w:right w:type="dxa" w:w="110"/>
+            </w:tcMar>
+          </w:tcPr>
+          <w:p>
+            <w:pPr>
+              <w:spacing w:after="40" w:line="264"/>
+            </w:pPr>
+            <w:r>
+              <w:rPr>
+                <w:b/>
+                <w:bCs/>
+              </w:rPr>
+              <w:t xml:space="preserve">Ce anume</w:t>
+            </w:r>
+          </w:p>
+        </w:tc>
+        <w:tc>
+          <w:tcPr>
+            <w:tcW w:type="dxa" w:w="2000"/>
+            <w:tcBorders>
+              <w:top w:val="single" w:color="B7C4D3" w:sz="4"/>
+              <w:left w:val="single" w:color="B7C4D3" w:sz="4"/>
+              <w:bottom w:val="single" w:color="B7C4D3" w:sz="4"/>
+              <w:right w:val="single" w:color="B7C4D3" w:sz="4"/>
+            </w:tcBorders>
+            <w:shd w:fill="E3ECF5" w:color="auto" w:val="clear"/>
+            <w:tcMar>
+              <w:top w:type="dxa" w:w="80"/>
+              <w:left w:type="dxa" w:w="110"/>
+              <w:bottom w:type="dxa" w:w="80"/>
+              <w:right w:type="dxa" w:w="110"/>
+            </w:tcMar>
+          </w:tcPr>
+          <w:p>
+            <w:pPr>
+              <w:spacing w:after="40" w:line="264"/>
+            </w:pPr>
+            <w:r>
+              <w:rPr>
+                <w:b/>
+                <w:bCs/>
+              </w:rPr>
+              <w:t xml:space="preserve">Licența</w:t>
+            </w:r>
+          </w:p>
+        </w:tc>
+        <w:tc>
+          <w:tcPr>
+            <w:tcW w:type="dxa" w:w="5038"/>
+            <w:tcBorders>
+              <w:top w:val="single" w:color="B7C4D3" w:sz="4"/>
+              <w:left w:val="single" w:color="B7C4D3" w:sz="4"/>
+              <w:bottom w:val="single" w:color="B7C4D3" w:sz="4"/>
+              <w:right w:val="single" w:color="B7C4D3" w:sz="4"/>
+            </w:tcBorders>
+            <w:shd w:fill="E3ECF5" w:color="auto" w:val="clear"/>
+            <w:tcMar>
+              <w:top w:type="dxa" w:w="80"/>
+              <w:left w:type="dxa" w:w="110"/>
+              <w:bottom w:type="dxa" w:w="80"/>
+              <w:right w:type="dxa" w:w="110"/>
+            </w:tcMar>
+          </w:tcPr>
+          <w:p>
+            <w:pPr>
+              <w:spacing w:after="40" w:line="264"/>
+            </w:pPr>
+            <w:r>
+              <w:rPr>
+                <w:b/>
+                <w:bCs/>
+              </w:rPr>
+              <w:t xml:space="preserve">Unde se află</w:t>
+            </w:r>
+          </w:p>
+        </w:tc>
+      </w:tr>
+      <w:tr>
+        <w:trPr>
+          <w:cantSplit/>
+        </w:trPr>
+        <w:tc>
+          <w:tcPr>
+            <w:tcW w:type="dxa" w:w="2600"/>
+            <w:tcBorders>
+              <w:top w:val="single" w:color="B7C4D3" w:sz="4"/>
+              <w:left w:val="single" w:color="B7C4D3" w:sz="4"/>
+              <w:bottom w:val="single" w:color="B7C4D3" w:sz="4"/>
+              <w:right w:val="single" w:color="B7C4D3" w:sz="4"/>
+            </w:tcBorders>
+            <w:tcMar>
+              <w:top w:type="dxa" w:w="80"/>
+              <w:left w:type="dxa" w:w="110"/>
+              <w:bottom w:type="dxa" w:w="80"/>
+              <w:right w:type="dxa" w:w="110"/>
+            </w:tcMar>
+          </w:tcPr>
+          <w:p>
+            <w:pPr>
+              <w:spacing w:after="40" w:line="264"/>
+            </w:pPr>
+            <w:r>
+              <w:t xml:space="preserve">Conținutul educațional</w:t>
+            </w:r>
+          </w:p>
+        </w:tc>
+        <w:tc>
+          <w:tcPr>
+            <w:tcW w:type="dxa" w:w="2000"/>
+            <w:tcBorders>
+              <w:top w:val="single" w:color="B7C4D3" w:sz="4"/>
+              <w:left w:val="single" w:color="B7C4D3" w:sz="4"/>
+              <w:bottom w:val="single" w:color="B7C4D3" w:sz="4"/>
+              <w:right w:val="single" w:color="B7C4D3" w:sz="4"/>
+            </w:tcBorders>
+            <w:tcMar>
+              <w:top w:type="dxa" w:w="80"/>
+              <w:left w:type="dxa" w:w="110"/>
+              <w:bottom w:type="dxa" w:w="80"/>
+              <w:right w:type="dxa" w:w="110"/>
+            </w:tcMar>
+          </w:tcPr>
+          <w:p>
+            <w:pPr>
+              <w:spacing w:after="40" w:line="264"/>
+            </w:pPr>
+            <w:r>
+              <w:rPr>
+                <w:b/>
+                <w:bCs/>
+              </w:rPr>
+              <w:t xml:space="preserve">CC BY-SA 4.0</w:t>
+            </w:r>
+          </w:p>
+        </w:tc>
+        <w:tc>
+          <w:tcPr>
+            <w:tcW w:type="dxa" w:w="5038"/>
+            <w:tcBorders>
+              <w:top w:val="single" w:color="B7C4D3" w:sz="4"/>
+              <w:left w:val="single" w:color="B7C4D3" w:sz="4"/>
+              <w:bottom w:val="single" w:color="B7C4D3" w:sz="4"/>
+              <w:right w:val="single" w:color="B7C4D3" w:sz="4"/>
+            </w:tcBorders>
+            <w:tcMar>
+              <w:top w:type="dxa" w:w="80"/>
+              <w:left w:type="dxa" w:w="110"/>
+              <w:bottom w:type="dxa" w:w="80"/>
+              <w:right w:type="dxa" w:w="110"/>
+            </w:tcMar>
+          </w:tcPr>
+          <w:p>
+            <w:pPr>
+              <w:spacing w:after="40" w:line="264"/>
+            </w:pPr>
+            <w:r>
+              <w:t xml:space="preserve">Lecțiile (</w:t>
+            </w:r>
+            <w:r>
+              <w:rPr>
+                <w:rFonts w:ascii="Consolas" w:cs="Consolas" w:eastAsia="Consolas" w:hAnsi="Consolas"/>
+                <w:color w:val="8A2B2B"/>
+                <w:sz w:val="20"/>
+                <w:szCs w:val="20"/>
+              </w:rPr>
+              <w:t xml:space="preserve">lectii.py</w:t>
+            </w:r>
+            <w:r>
+              <w:t xml:space="preserve">), întrebările (</w:t>
+            </w:r>
+            <w:r>
+              <w:rPr>
+                <w:rFonts w:ascii="Consolas" w:cs="Consolas" w:eastAsia="Consolas" w:hAnsi="Consolas"/>
+                <w:color w:val="8A2B2B"/>
+                <w:sz w:val="20"/>
+                <w:szCs w:val="20"/>
+              </w:rPr>
+              <w:t xml:space="preserve">intrebari.json</w:t>
+            </w:r>
+            <w:r>
+              <w:t xml:space="preserve">), </w:t>
+            </w:r>
+            <w:r>
+              <w:rPr>
+                <w:rFonts w:ascii="Consolas" w:cs="Consolas" w:eastAsia="Consolas" w:hAnsi="Consolas"/>
+                <w:color w:val="8A2B2B"/>
+                <w:sz w:val="20"/>
+                <w:szCs w:val="20"/>
+              </w:rPr>
+              <w:t xml:space="preserve">fisa_RED.md</w:t>
+            </w:r>
+            <w:r>
+              <w:t xml:space="preserve">, manualele, textele din aplicație</w:t>
+            </w:r>
+          </w:p>
+        </w:tc>
+      </w:tr>
+      <w:tr>
+        <w:trPr>
+          <w:cantSplit/>
+        </w:trPr>
+        <w:tc>
+          <w:tcPr>
+            <w:tcW w:type="dxa" w:w="2600"/>
+            <w:tcBorders>
+              <w:top w:val="single" w:color="B7C4D3" w:sz="4"/>
+              <w:left w:val="single" w:color="B7C4D3" w:sz="4"/>
+              <w:bottom w:val="single" w:color="B7C4D3" w:sz="4"/>
+              <w:right w:val="single" w:color="B7C4D3" w:sz="4"/>
+            </w:tcBorders>
+            <w:tcMar>
+              <w:top w:type="dxa" w:w="80"/>
+              <w:left w:type="dxa" w:w="110"/>
+              <w:bottom w:type="dxa" w:w="80"/>
+              <w:right w:type="dxa" w:w="110"/>
+            </w:tcMar>
+          </w:tcPr>
+          <w:p>
+            <w:pPr>
+              <w:spacing w:after="40" w:line="264"/>
+            </w:pPr>
+            <w:r>
+              <w:t xml:space="preserve">Codul</w:t>
+            </w:r>
+          </w:p>
+        </w:tc>
+        <w:tc>
+          <w:tcPr>
+            <w:tcW w:type="dxa" w:w="2000"/>
+            <w:tcBorders>
+              <w:top w:val="single" w:color="B7C4D3" w:sz="4"/>
+              <w:left w:val="single" w:color="B7C4D3" w:sz="4"/>
+              <w:bottom w:val="single" w:color="B7C4D3" w:sz="4"/>
+              <w:right w:val="single" w:color="B7C4D3" w:sz="4"/>
+            </w:tcBorders>
+            <w:tcMar>
+              <w:top w:type="dxa" w:w="80"/>
+              <w:left w:type="dxa" w:w="110"/>
+              <w:bottom w:type="dxa" w:w="80"/>
+              <w:right w:type="dxa" w:w="110"/>
+            </w:tcMar>
+          </w:tcPr>
+          <w:p>
+            <w:pPr>
+              <w:spacing w:after="40" w:line="264"/>
+            </w:pPr>
+            <w:r>
+              <w:rPr>
+                <w:b/>
+                <w:bCs/>
+              </w:rPr>
+              <w:t xml:space="preserve">MIT</w:t>
+            </w:r>
+          </w:p>
+        </w:tc>
+        <w:tc>
+          <w:tcPr>
+            <w:tcW w:type="dxa" w:w="5038"/>
+            <w:tcBorders>
+              <w:top w:val="single" w:color="B7C4D3" w:sz="4"/>
+              <w:left w:val="single" w:color="B7C4D3" w:sz="4"/>
+              <w:bottom w:val="single" w:color="B7C4D3" w:sz="4"/>
+              <w:right w:val="single" w:color="B7C4D3" w:sz="4"/>
+            </w:tcBorders>
+            <w:tcMar>
+              <w:top w:type="dxa" w:w="80"/>
+              <w:left w:type="dxa" w:w="110"/>
+              <w:bottom w:type="dxa" w:w="80"/>
+              <w:right w:type="dxa" w:w="110"/>
+            </w:tcMar>
+          </w:tcPr>
+          <w:p>
+            <w:pPr>
+              <w:spacing w:after="40" w:line="264"/>
+            </w:pPr>
+            <w:r>
+              <w:t xml:space="preserve">Fișierele </w:t>
+            </w:r>
+            <w:r>
+              <w:rPr>
+                <w:rFonts w:ascii="Consolas" w:cs="Consolas" w:eastAsia="Consolas" w:hAnsi="Consolas"/>
+                <w:color w:val="8A2B2B"/>
+                <w:sz w:val="20"/>
+                <w:szCs w:val="20"/>
+              </w:rPr>
+              <w:t xml:space="preserve">.py</w:t>
+            </w:r>
+          </w:p>
+        </w:tc>
+      </w:tr>
+    </w:tbl>
+    <w:p>
+      <w:pPr>
+        <w:spacing w:after="120"/>
+      </w:pPr>
+    </w:p>
+    <w:p>
+      <w:pPr>
+        <w:pStyle w:val="Heading2"/>
+      </w:pPr>
+      <w:r>
+        <w:t xml:space="preserve">14.1 Ce este CC BY-SA 4.0</w:t>
+      </w:r>
+    </w:p>
+    <w:p>
+      <w:pPr>
+        <w:spacing w:after="120" w:line="288"/>
+      </w:pPr>
+      <w:r>
+        <w:t xml:space="preserve">Este o licență </w:t>
+      </w:r>
+      <w:r>
+        <w:rPr>
+          <w:b/>
+          <w:bCs/>
+        </w:rPr>
+        <w:t xml:space="preserve">Creative Commons</w:t>
+      </w:r>
+      <w:r>
+        <w:t xml:space="preserve">. Prin ea, autorul spune din start ce au voie alții să facă cu materialul, fără să mai ceară permisiunea de fiecare dată. Este licența folosită, de exemplu, de </w:t>
+      </w:r>
+      <w:r>
+        <w:rPr>
+          <w:b/>
+          <w:bCs/>
+        </w:rPr>
+        <w:t xml:space="preserve">Wikipedia</w:t>
+      </w:r>
+      <w:r>
+        <w:t xml:space="preserve">.</w:t>
+      </w:r>
+    </w:p>
+    <w:tbl>
+      <w:tblPr>
+        <w:tblW w:type="dxa" w:w="9638"/>
+        <w:tblBorders>
+          <w:top w:val="single" w:color="auto" w:sz="4"/>
+          <w:left w:val="single" w:color="auto" w:sz="4"/>
+          <w:bottom w:val="single" w:color="auto" w:sz="4"/>
+          <w:right w:val="single" w:color="auto" w:sz="4"/>
+          <w:insideH w:val="single" w:color="auto" w:sz="4"/>
+          <w:insideV w:val="single" w:color="auto" w:sz="4"/>
+        </w:tblBorders>
+        <w:tblLayout w:type="fixed"/>
+      </w:tblPr>
+      <w:tblGrid>
+        <w:gridCol w:w="1300"/>
+        <w:gridCol w:w="3400"/>
+        <w:gridCol w:w="4938"/>
+      </w:tblGrid>
+      <w:tr>
+        <w:trPr>
+          <w:tblHeader/>
+        </w:trPr>
+        <w:tc>
+          <w:tcPr>
+            <w:tcW w:type="dxa" w:w="1300"/>
+            <w:tcBorders>
+              <w:top w:val="single" w:color="B7C4D3" w:sz="4"/>
+              <w:left w:val="single" w:color="B7C4D3" w:sz="4"/>
+              <w:bottom w:val="single" w:color="B7C4D3" w:sz="4"/>
+              <w:right w:val="single" w:color="B7C4D3" w:sz="4"/>
+            </w:tcBorders>
+            <w:shd w:fill="E3ECF5" w:color="auto" w:val="clear"/>
+            <w:tcMar>
+              <w:top w:type="dxa" w:w="80"/>
+              <w:left w:type="dxa" w:w="110"/>
+              <w:bottom w:type="dxa" w:w="80"/>
+              <w:right w:type="dxa" w:w="110"/>
+            </w:tcMar>
+          </w:tcPr>
+          <w:p>
+            <w:pPr>
+              <w:spacing w:after="40" w:line="264"/>
+            </w:pPr>
+            <w:r>
+              <w:rPr>
+                <w:b/>
+                <w:bCs/>
+              </w:rPr>
+              <w:t xml:space="preserve">Parte</w:t>
+            </w:r>
+          </w:p>
+        </w:tc>
+        <w:tc>
+          <w:tcPr>
+            <w:tcW w:type="dxa" w:w="3400"/>
+            <w:tcBorders>
+              <w:top w:val="single" w:color="B7C4D3" w:sz="4"/>
+              <w:left w:val="single" w:color="B7C4D3" w:sz="4"/>
+              <w:bottom w:val="single" w:color="B7C4D3" w:sz="4"/>
+              <w:right w:val="single" w:color="B7C4D3" w:sz="4"/>
+            </w:tcBorders>
+            <w:shd w:fill="E3ECF5" w:color="auto" w:val="clear"/>
+            <w:tcMar>
+              <w:top w:type="dxa" w:w="80"/>
+              <w:left w:type="dxa" w:w="110"/>
+              <w:bottom w:type="dxa" w:w="80"/>
+              <w:right w:type="dxa" w:w="110"/>
+            </w:tcMar>
+          </w:tcPr>
+          <w:p>
+            <w:pPr>
+              <w:spacing w:after="40" w:line="264"/>
+            </w:pPr>
+            <w:r>
+              <w:rPr>
+                <w:b/>
+                <w:bCs/>
+              </w:rPr>
+              <w:t xml:space="preserve">În engleză</w:t>
+            </w:r>
+          </w:p>
+        </w:tc>
+        <w:tc>
+          <w:tcPr>
+            <w:tcW w:type="dxa" w:w="4938"/>
+            <w:tcBorders>
+              <w:top w:val="single" w:color="B7C4D3" w:sz="4"/>
+              <w:left w:val="single" w:color="B7C4D3" w:sz="4"/>
+              <w:bottom w:val="single" w:color="B7C4D3" w:sz="4"/>
+              <w:right w:val="single" w:color="B7C4D3" w:sz="4"/>
+            </w:tcBorders>
+            <w:shd w:fill="E3ECF5" w:color="auto" w:val="clear"/>
+            <w:tcMar>
+              <w:top w:type="dxa" w:w="80"/>
+              <w:left w:type="dxa" w:w="110"/>
+              <w:bottom w:type="dxa" w:w="80"/>
+              <w:right w:type="dxa" w:w="110"/>
+            </w:tcMar>
+          </w:tcPr>
+          <w:p>
+            <w:pPr>
+              <w:spacing w:after="40" w:line="264"/>
+            </w:pPr>
+            <w:r>
+              <w:rPr>
+                <w:b/>
+                <w:bCs/>
+              </w:rPr>
+              <w:t xml:space="preserve">Ce înseamnă</w:t>
+            </w:r>
+          </w:p>
+        </w:tc>
+      </w:tr>
+      <w:tr>
+        <w:trPr>
+          <w:cantSplit/>
+        </w:trPr>
+        <w:tc>
+          <w:tcPr>
+            <w:tcW w:type="dxa" w:w="1300"/>
+            <w:tcBorders>
+              <w:top w:val="single" w:color="B7C4D3" w:sz="4"/>
+              <w:left w:val="single" w:color="B7C4D3" w:sz="4"/>
+              <w:bottom w:val="single" w:color="B7C4D3" w:sz="4"/>
+              <w:right w:val="single" w:color="B7C4D3" w:sz="4"/>
+            </w:tcBorders>
+            <w:tcMar>
+              <w:top w:type="dxa" w:w="80"/>
+              <w:left w:type="dxa" w:w="110"/>
+              <w:bottom w:type="dxa" w:w="80"/>
+              <w:right w:type="dxa" w:w="110"/>
+            </w:tcMar>
+          </w:tcPr>
+          <w:p>
+            <w:pPr>
+              <w:spacing w:after="40" w:line="264"/>
+            </w:pPr>
+            <w:r>
+              <w:rPr>
+                <w:b/>
+                <w:bCs/>
+              </w:rPr>
+              <w:t xml:space="preserve">CC</w:t>
+            </w:r>
+          </w:p>
+        </w:tc>
+        <w:tc>
+          <w:tcPr>
+            <w:tcW w:type="dxa" w:w="3400"/>
+            <w:tcBorders>
+              <w:top w:val="single" w:color="B7C4D3" w:sz="4"/>
+              <w:left w:val="single" w:color="B7C4D3" w:sz="4"/>
+              <w:bottom w:val="single" w:color="B7C4D3" w:sz="4"/>
+              <w:right w:val="single" w:color="B7C4D3" w:sz="4"/>
+            </w:tcBorders>
+            <w:tcMar>
+              <w:top w:type="dxa" w:w="80"/>
+              <w:left w:type="dxa" w:w="110"/>
+              <w:bottom w:type="dxa" w:w="80"/>
+              <w:right w:type="dxa" w:w="110"/>
+            </w:tcMar>
+          </w:tcPr>
+          <w:p>
+            <w:pPr>
+              <w:spacing w:after="40" w:line="264"/>
+            </w:pPr>
+            <w:r>
+              <w:t xml:space="preserve">Creative Commons</w:t>
+            </w:r>
+          </w:p>
+        </w:tc>
+        <w:tc>
+          <w:tcPr>
+            <w:tcW w:type="dxa" w:w="4938"/>
+            <w:tcBorders>
+              <w:top w:val="single" w:color="B7C4D3" w:sz="4"/>
+              <w:left w:val="single" w:color="B7C4D3" w:sz="4"/>
+              <w:bottom w:val="single" w:color="B7C4D3" w:sz="4"/>
+              <w:right w:val="single" w:color="B7C4D3" w:sz="4"/>
+            </w:tcBorders>
+            <w:tcMar>
+              <w:top w:type="dxa" w:w="80"/>
+              <w:left w:type="dxa" w:w="110"/>
+              <w:bottom w:type="dxa" w:w="80"/>
+              <w:right w:type="dxa" w:w="110"/>
+            </w:tcMar>
+          </w:tcPr>
+          <w:p>
+            <w:pPr>
+              <w:spacing w:after="40" w:line="264"/>
+            </w:pPr>
+            <w:r>
+              <w:t xml:space="preserve">Organizația care a creat aceste licențe gratuite</w:t>
+            </w:r>
+          </w:p>
+        </w:tc>
+      </w:tr>
+      <w:tr>
+        <w:trPr>
+          <w:cantSplit/>
+        </w:trPr>
+        <w:tc>
+          <w:tcPr>
+            <w:tcW w:type="dxa" w:w="1300"/>
+            <w:tcBorders>
+              <w:top w:val="single" w:color="B7C4D3" w:sz="4"/>
+              <w:left w:val="single" w:color="B7C4D3" w:sz="4"/>
+              <w:bottom w:val="single" w:color="B7C4D3" w:sz="4"/>
+              <w:right w:val="single" w:color="B7C4D3" w:sz="4"/>
+            </w:tcBorders>
+            <w:tcMar>
+              <w:top w:type="dxa" w:w="80"/>
+              <w:left w:type="dxa" w:w="110"/>
+              <w:bottom w:type="dxa" w:w="80"/>
+              <w:right w:type="dxa" w:w="110"/>
+            </w:tcMar>
+          </w:tcPr>
+          <w:p>
+            <w:pPr>
+              <w:spacing w:after="40" w:line="264"/>
+            </w:pPr>
+            <w:r>
+              <w:rPr>
+                <w:b/>
+                <w:bCs/>
+              </w:rPr>
+              <w:t xml:space="preserve">BY</w:t>
+            </w:r>
+          </w:p>
+        </w:tc>
+        <w:tc>
+          <w:tcPr>
+            <w:tcW w:type="dxa" w:w="3400"/>
+            <w:tcBorders>
+              <w:top w:val="single" w:color="B7C4D3" w:sz="4"/>
+              <w:left w:val="single" w:color="B7C4D3" w:sz="4"/>
+              <w:bottom w:val="single" w:color="B7C4D3" w:sz="4"/>
+              <w:right w:val="single" w:color="B7C4D3" w:sz="4"/>
+            </w:tcBorders>
+            <w:tcMar>
+              <w:top w:type="dxa" w:w="80"/>
+              <w:left w:type="dxa" w:w="110"/>
+              <w:bottom w:type="dxa" w:w="80"/>
+              <w:right w:type="dxa" w:w="110"/>
+            </w:tcMar>
+          </w:tcPr>
+          <w:p>
+            <w:pPr>
+              <w:spacing w:after="40" w:line="264"/>
+            </w:pPr>
+            <w:r>
+              <w:t xml:space="preserve">Attribution (Atribuire)</w:t>
+            </w:r>
+          </w:p>
+        </w:tc>
+        <w:tc>
+          <w:tcPr>
+            <w:tcW w:type="dxa" w:w="4938"/>
+            <w:tcBorders>
+              <w:top w:val="single" w:color="B7C4D3" w:sz="4"/>
+              <w:left w:val="single" w:color="B7C4D3" w:sz="4"/>
+              <w:bottom w:val="single" w:color="B7C4D3" w:sz="4"/>
+              <w:right w:val="single" w:color="B7C4D3" w:sz="4"/>
+            </w:tcBorders>
+            <w:tcMar>
+              <w:top w:type="dxa" w:w="80"/>
+              <w:left w:type="dxa" w:w="110"/>
+              <w:bottom w:type="dxa" w:w="80"/>
+              <w:right w:type="dxa" w:w="110"/>
+            </w:tcMar>
+          </w:tcPr>
+          <w:p>
+            <w:pPr>
+              <w:spacing w:after="40" w:line="264"/>
+            </w:pPr>
+            <w:r>
+              <w:t xml:space="preserve">Cine folosește materialul trebuie să </w:t>
+            </w:r>
+            <w:r>
+              <w:rPr>
+                <w:b/>
+                <w:bCs/>
+              </w:rPr>
+              <w:t xml:space="preserve">menționeze autorul</w:t>
+            </w:r>
+          </w:p>
+        </w:tc>
+      </w:tr>
+      <w:tr>
+        <w:trPr>
+          <w:cantSplit/>
+        </w:trPr>
+        <w:tc>
+          <w:tcPr>
+            <w:tcW w:type="dxa" w:w="1300"/>
+            <w:tcBorders>
+              <w:top w:val="single" w:color="B7C4D3" w:sz="4"/>
+              <w:left w:val="single" w:color="B7C4D3" w:sz="4"/>
+              <w:bottom w:val="single" w:color="B7C4D3" w:sz="4"/>
+              <w:right w:val="single" w:color="B7C4D3" w:sz="4"/>
+            </w:tcBorders>
+            <w:tcMar>
+              <w:top w:type="dxa" w:w="80"/>
+              <w:left w:type="dxa" w:w="110"/>
+              <w:bottom w:type="dxa" w:w="80"/>
+              <w:right w:type="dxa" w:w="110"/>
+            </w:tcMar>
+          </w:tcPr>
+          <w:p>
+            <w:pPr>
+              <w:spacing w:after="40" w:line="264"/>
+            </w:pPr>
+            <w:r>
+              <w:rPr>
+                <w:b/>
+                <w:bCs/>
+              </w:rPr>
+              <w:t xml:space="preserve">SA</w:t>
+            </w:r>
+          </w:p>
+        </w:tc>
+        <w:tc>
+          <w:tcPr>
+            <w:tcW w:type="dxa" w:w="3400"/>
+            <w:tcBorders>
+              <w:top w:val="single" w:color="B7C4D3" w:sz="4"/>
+              <w:left w:val="single" w:color="B7C4D3" w:sz="4"/>
+              <w:bottom w:val="single" w:color="B7C4D3" w:sz="4"/>
+              <w:right w:val="single" w:color="B7C4D3" w:sz="4"/>
+            </w:tcBorders>
+            <w:tcMar>
+              <w:top w:type="dxa" w:w="80"/>
+              <w:left w:type="dxa" w:w="110"/>
+              <w:bottom w:type="dxa" w:w="80"/>
+              <w:right w:type="dxa" w:w="110"/>
+            </w:tcMar>
+          </w:tcPr>
+          <w:p>
+            <w:pPr>
+              <w:spacing w:after="40" w:line="264"/>
+            </w:pPr>
+            <w:r>
+              <w:t xml:space="preserve">ShareAlike (Distribuire în condiții identice)</w:t>
+            </w:r>
+          </w:p>
+        </w:tc>
+        <w:tc>
+          <w:tcPr>
+            <w:tcW w:type="dxa" w:w="4938"/>
+            <w:tcBorders>
+              <w:top w:val="single" w:color="B7C4D3" w:sz="4"/>
+              <w:left w:val="single" w:color="B7C4D3" w:sz="4"/>
+              <w:bottom w:val="single" w:color="B7C4D3" w:sz="4"/>
+              <w:right w:val="single" w:color="B7C4D3" w:sz="4"/>
+            </w:tcBorders>
+            <w:tcMar>
+              <w:top w:type="dxa" w:w="80"/>
+              <w:left w:type="dxa" w:w="110"/>
+              <w:bottom w:type="dxa" w:w="80"/>
+              <w:right w:type="dxa" w:w="110"/>
+            </w:tcMar>
+          </w:tcPr>
+          <w:p>
+            <w:pPr>
+              <w:spacing w:after="40" w:line="264"/>
+            </w:pPr>
+            <w:r>
+              <w:t xml:space="preserve">Cine îl modifică și îl publică trebuie să-l publice </w:t>
+            </w:r>
+            <w:r>
+              <w:rPr>
+                <w:b/>
+                <w:bCs/>
+              </w:rPr>
+              <w:t xml:space="preserve">sub aceeași licență</w:t>
+            </w:r>
+          </w:p>
+        </w:tc>
+      </w:tr>
+      <w:tr>
+        <w:trPr>
+          <w:cantSplit/>
+        </w:trPr>
+        <w:tc>
+          <w:tcPr>
+            <w:tcW w:type="dxa" w:w="1300"/>
+            <w:tcBorders>
+              <w:top w:val="single" w:color="B7C4D3" w:sz="4"/>
+              <w:left w:val="single" w:color="B7C4D3" w:sz="4"/>
+              <w:bottom w:val="single" w:color="B7C4D3" w:sz="4"/>
+              <w:right w:val="single" w:color="B7C4D3" w:sz="4"/>
+            </w:tcBorders>
+            <w:tcMar>
+              <w:top w:type="dxa" w:w="80"/>
+              <w:left w:type="dxa" w:w="110"/>
+              <w:bottom w:type="dxa" w:w="80"/>
+              <w:right w:type="dxa" w:w="110"/>
+            </w:tcMar>
+          </w:tcPr>
+          <w:p>
+            <w:pPr>
+              <w:spacing w:after="40" w:line="264"/>
+            </w:pPr>
+            <w:r>
+              <w:rPr>
+                <w:b/>
+                <w:bCs/>
+              </w:rPr>
+              <w:t xml:space="preserve">4.0</w:t>
+            </w:r>
+          </w:p>
+        </w:tc>
+        <w:tc>
+          <w:tcPr>
+            <w:tcW w:type="dxa" w:w="3400"/>
+            <w:tcBorders>
+              <w:top w:val="single" w:color="B7C4D3" w:sz="4"/>
+              <w:left w:val="single" w:color="B7C4D3" w:sz="4"/>
+              <w:bottom w:val="single" w:color="B7C4D3" w:sz="4"/>
+              <w:right w:val="single" w:color="B7C4D3" w:sz="4"/>
+            </w:tcBorders>
+            <w:tcMar>
+              <w:top w:type="dxa" w:w="80"/>
+              <w:left w:type="dxa" w:w="110"/>
+              <w:bottom w:type="dxa" w:w="80"/>
+              <w:right w:type="dxa" w:w="110"/>
+            </w:tcMar>
+          </w:tcPr>
+          <w:p>
+            <w:pPr>
+              <w:spacing w:after="40" w:line="264"/>
+            </w:pPr>
+            <w:r>
+              <w:t xml:space="preserve">versiunea</w:t>
+            </w:r>
+          </w:p>
+        </w:tc>
+        <w:tc>
+          <w:tcPr>
+            <w:tcW w:type="dxa" w:w="4938"/>
+            <w:tcBorders>
+              <w:top w:val="single" w:color="B7C4D3" w:sz="4"/>
+              <w:left w:val="single" w:color="B7C4D3" w:sz="4"/>
+              <w:bottom w:val="single" w:color="B7C4D3" w:sz="4"/>
+              <w:right w:val="single" w:color="B7C4D3" w:sz="4"/>
+            </w:tcBorders>
+            <w:tcMar>
+              <w:top w:type="dxa" w:w="80"/>
+              <w:left w:type="dxa" w:w="110"/>
+              <w:bottom w:type="dxa" w:w="80"/>
+              <w:right w:type="dxa" w:w="110"/>
+            </w:tcMar>
+          </w:tcPr>
+          <w:p>
+            <w:pPr>
+              <w:spacing w:after="40" w:line="264"/>
+            </w:pPr>
+            <w:r>
+              <w:t xml:space="preserve">A patra versiune, cea actuală, valabilă internațional</w:t>
+            </w:r>
+          </w:p>
+        </w:tc>
+      </w:tr>
+    </w:tbl>
+    <w:p>
+      <w:pPr>
+        <w:spacing w:after="120"/>
+      </w:pPr>
+    </w:p>
+    <w:p>
+      <w:pPr>
+        <w:pStyle w:val="Heading3"/>
+      </w:pPr>
+      <w:r>
+        <w:t xml:space="preserve">Ce are voie oricine</w:t>
+      </w:r>
+    </w:p>
+    <w:p>
+      <w:pPr>
+        <w:pStyle w:val="ListParagraph"/>
+        <w:numPr>
+          <w:ilvl w:val="0"/>
+          <w:numId w:val="3"/>
+        </w:numPr>
+        <w:spacing w:after="60" w:line="276"/>
+      </w:pPr>
+      <w:r>
+        <w:rPr>
+          <w:b/>
+          <w:bCs/>
+        </w:rPr>
+        <w:t xml:space="preserve">să copieze și să distribuie</w:t>
+      </w:r>
+      <w:r>
+        <w:t xml:space="preserve"> materialul: să-l printeze, să-l pună pe un site, să-l trimită elevilor;</w:t>
+      </w:r>
+    </w:p>
+    <w:p>
+      <w:pPr>
+        <w:pStyle w:val="ListParagraph"/>
+        <w:numPr>
+          <w:ilvl w:val="0"/>
+          <w:numId w:val="3"/>
+        </w:numPr>
+        <w:spacing w:after="60" w:line="276"/>
+      </w:pPr>
+      <w:r>
+        <w:rPr>
+          <w:b/>
+          <w:bCs/>
+        </w:rPr>
+        <w:t xml:space="preserve">să-l modifice și să-l adapteze</w:t>
+      </w:r>
+      <w:r>
+        <w:t xml:space="preserve">: să adauge întrebări, să schimbe lecții, să-l traducă;</w:t>
+      </w:r>
+    </w:p>
+    <w:p>
+      <w:pPr>
+        <w:pStyle w:val="ListParagraph"/>
+        <w:numPr>
+          <w:ilvl w:val="0"/>
+          <w:numId w:val="3"/>
+        </w:numPr>
+        <w:spacing w:after="60" w:line="276"/>
+      </w:pPr>
+      <w:r>
+        <w:rPr>
+          <w:b/>
+          <w:bCs/>
+        </w:rPr>
+        <w:t xml:space="preserve">să-l folosească în orice scop</w:t>
+      </w:r>
+      <w:r>
+        <w:t xml:space="preserve">, inclusiv comercial.</w:t>
+      </w:r>
+    </w:p>
+    <w:p>
+      <w:pPr>
+        <w:pStyle w:val="Heading3"/>
+      </w:pPr>
+      <w:r>
+        <w:t xml:space="preserve">Cu ce condiții</w:t>
+      </w:r>
+    </w:p>
+    <w:p>
+      <w:pPr>
+        <w:pStyle w:val="ListParagraph"/>
+        <w:numPr>
+          <w:ilvl w:val="0"/>
+          <w:numId w:val="8"/>
+        </w:numPr>
+        <w:spacing w:after="60" w:line="276"/>
+      </w:pPr>
+      <w:r>
+        <w:rPr>
+          <w:b/>
+          <w:bCs/>
+        </w:rPr>
+        <w:t xml:space="preserve">Atribuire:</w:t>
+      </w:r>
+      <w:r>
+        <w:t xml:space="preserve"> menționează autorul și licența și spune dacă a făcut modificări.</w:t>
+      </w:r>
+    </w:p>
+    <w:p>
+      <w:pPr>
+        <w:pStyle w:val="ListParagraph"/>
+        <w:numPr>
+          <w:ilvl w:val="0"/>
+          <w:numId w:val="8"/>
+        </w:numPr>
+        <w:spacing w:after="60" w:line="276"/>
+      </w:pPr>
+      <w:r>
+        <w:rPr>
+          <w:b/>
+          <w:bCs/>
+        </w:rPr>
+        <w:t xml:space="preserve">Aceeași licență:</w:t>
+      </w:r>
+      <w:r>
+        <w:t xml:space="preserve"> dacă publică o versiune modificată, o lasă la fel de liberă, tot sub CC BY-SA 4.0. Nu o poate „închide” și vinde ca pe a lui.</w:t>
+      </w:r>
+    </w:p>
+    <w:p>
+      <w:pPr>
+        <w:pBdr>
+          <w:left w:val="single" w:color="1F4E79" w:sz="24" w:space="8"/>
+        </w:pBdr>
+        <w:shd w:fill="EEF4FA" w:color="auto" w:val="clear"/>
+        <w:spacing w:after="200" w:before="120" w:line="288"/>
+        <w:ind w:left="240"/>
+      </w:pPr>
+      <w:r>
+        <w:t xml:space="preserve">„LogicLab”, de BASALIC Mihai (Colegiul Național Militar «Tudor Vladimirescu»), licența CC BY-SA 4.0, github.com/cub-lab/Erasmus</w:t>
+      </w:r>
+    </w:p>
+    <w:p>
+      <w:pPr>
+        <w:pStyle w:val="Heading2"/>
+      </w:pPr>
+      <w:r>
+        <w:t xml:space="preserve">14.2 De ce se potrivește la LogicLab</w:t>
+      </w:r>
+    </w:p>
+    <w:p>
+      <w:pPr>
+        <w:spacing w:after="120" w:line="288"/>
+      </w:pPr>
+      <w:r>
+        <w:t xml:space="preserve">O </w:t>
+      </w:r>
+      <w:r>
+        <w:rPr>
+          <w:b/>
+          <w:bCs/>
+        </w:rPr>
+        <w:t xml:space="preserve">Resursă Educațională Deschisă</w:t>
+      </w:r>
+      <w:r>
+        <w:t xml:space="preserve"> trebuie, prin definiție, să poată fi folosită și adaptată liber de alți profesori și elevi. CC BY-SA 4.0 permite exact asta și, în plus:</w:t>
+      </w:r>
+    </w:p>
+    <w:p>
+      <w:pPr>
+        <w:pStyle w:val="ListParagraph"/>
+        <w:numPr>
+          <w:ilvl w:val="0"/>
+          <w:numId w:val="3"/>
+        </w:numPr>
+        <w:spacing w:after="60" w:line="276"/>
+      </w:pPr>
+      <w:r>
+        <w:rPr>
+          <w:b/>
+          <w:bCs/>
+        </w:rPr>
+        <w:t xml:space="preserve">îl protejează pe autor</w:t>
+      </w:r>
+      <w:r>
+        <w:t xml:space="preserve">: numele lui rămâne pe material, chiar și în versiunile modificate;</w:t>
+      </w:r>
+    </w:p>
+    <w:p>
+      <w:pPr>
+        <w:pStyle w:val="ListParagraph"/>
+        <w:numPr>
+          <w:ilvl w:val="0"/>
+          <w:numId w:val="3"/>
+        </w:numPr>
+        <w:spacing w:after="60" w:line="276"/>
+      </w:pPr>
+      <w:r>
+        <w:rPr>
+          <w:b/>
+          <w:bCs/>
+        </w:rPr>
+        <w:t xml:space="preserve">păstrează resursa deschisă</w:t>
+      </w:r>
+      <w:r>
+        <w:t xml:space="preserve">: orice îmbunătățire făcută de altcineva rămâne și ea liberă pentru toți.</w:t>
+      </w:r>
+    </w:p>
+    <w:p>
+      <w:pPr>
+        <w:pStyle w:val="Heading2"/>
+      </w:pPr>
+      <w:r>
+        <w:t xml:space="preserve">14.3 De ce codul are altă licență (MIT)</w:t>
+      </w:r>
+    </w:p>
+    <w:p>
+      <w:pPr>
+        <w:spacing w:after="120" w:line="288"/>
+      </w:pPr>
+      <w:r>
+        <w:t xml:space="preserve">Licențele Creative Commons sunt gândite pentru </w:t>
+      </w:r>
+      <w:r>
+        <w:rPr>
+          <w:b/>
+          <w:bCs/>
+        </w:rPr>
+        <w:t xml:space="preserve">texte, imagini și materiale educaționale</w:t>
+      </w:r>
+      <w:r>
+        <w:t xml:space="preserve">, nu pentru programe. Pentru cod se folosesc licențe de software. </w:t>
+      </w:r>
+      <w:r>
+        <w:rPr>
+          <w:b/>
+          <w:bCs/>
+        </w:rPr>
+        <w:t xml:space="preserve">MIT</w:t>
+      </w:r>
+      <w:r>
+        <w:t xml:space="preserve"> este una dintre cele mai simple: oricine poate folosi codul cum vrea, cu o singură condiție, să păstreze mențiunea „Copyright (c) 2026 BASALIC Mihai”.</w:t>
+      </w:r>
+    </w:p>
+    <w:p>
+      <w:pPr>
+        <w:pStyle w:val="Heading2"/>
+      </w:pPr>
+      <w:r>
+        <w:t xml:space="preserve">14.4 Răspunsul scurt pentru comisie</w:t>
+      </w:r>
+    </w:p>
+    <w:p>
+      <w:pPr>
+        <w:pBdr>
+          <w:left w:val="single" w:color="2E7D32" w:sz="24" w:space="8"/>
+        </w:pBdr>
+        <w:shd w:fill="EEF4FA" w:color="auto" w:val="clear"/>
+        <w:spacing w:after="200" w:before="120" w:line="288"/>
+        <w:ind w:left="240"/>
+      </w:pPr>
+      <w:r>
+        <w:t xml:space="preserve">„Am ales CC BY-SA 4.0 pentru conținut pentru că este licența standard pentru resurse educaționale deschise: oricine poate folosi și adapta lecțiile și întrebările, cu condiția să mă menționeze ca autor și să lase și versiunea lui la fel de deschisă. Pentru cod am ales MIT, o licență simplă de software.”</w:t>
+      </w:r>
+    </w:p>
+    <w:p>
+      <w:pPr>
+        <w:spacing w:after="120" w:line="288"/>
+      </w:pPr>
+      <w:r>
+        <w:t xml:space="preserve">Rezumatul oficial al licenței, în limba română: creativecommons.org/licenses/by-sa/4.0/deed.ro</w:t>
+      </w:r>
+    </w:p>
     <w:sectPr>
       <w:headerReference w:type="default" r:id="rId6"/>
       <w:headerReference w:type="first" r:id="rId7"/>
@@ -20779,6 +21949,12 @@
     </w:lvlOverride>
   </w:num>
   <w:num w:numId="7">
+    <w:abstractNumId w:val="3"/>
+    <w:lvlOverride w:ilvl="0">
+      <w:startOverride w:val="1"/>
+    </w:lvlOverride>
+  </w:num>
+  <w:num w:numId="8">
     <w:abstractNumId w:val="3"/>
     <w:lvlOverride w:ilvl="0">
       <w:startOverride w:val="1"/>

</xml_diff>